<commit_message>
docs(google): fill reviewer credentials and demo video into the OAuth testing guidelines
</commit_message>
<xml_diff>
--- a/GOOGLE_REVIEWER_TESTING_GUIDELINES.docx
+++ b/GOOGLE_REVIEWER_TESTING_GUIDELINES.docx
@@ -166,7 +166,7 @@
               <w:rPr>
                 <w:sz w:val="20"/>
               </w:rPr>
-              <w:t>August 18, 2026</w:t>
+              <w:t>August 19, 2026</w:t>
             </w:r>
           </w:p>
         </w:tc>
@@ -196,6 +196,35 @@
                 <w:sz w:val="20"/>
               </w:rPr>
               <w:t>Production only — `https://app.velvetelves.com`</w:t>
+            </w:r>
+          </w:p>
+        </w:tc>
+      </w:tr>
+      <w:tr>
+        <w:tc>
+          <w:tcPr>
+            <w:tcW w:type="dxa" w:w="4680"/>
+          </w:tcPr>
+          <w:p>
+            <w:r>
+              <w:rPr>
+                <w:b/>
+                <w:sz w:val="20"/>
+              </w:rPr>
+              <w:t>Demonstration video</w:t>
+            </w:r>
+          </w:p>
+        </w:tc>
+        <w:tc>
+          <w:tcPr>
+            <w:tcW w:type="dxa" w:w="4680"/>
+          </w:tcPr>
+          <w:p>
+            <w:r>
+              <w:rPr>
+                <w:sz w:val="20"/>
+              </w:rPr>
+              <w:t>https://youtu.be/RdPv_3vw6NM</w:t>
             </w:r>
           </w:p>
         </w:tc>
@@ -482,7 +511,7 @@
                 <w:b w:val="0"/>
                 <w:sz w:val="20"/>
               </w:rPr>
-              <w:t>Insert before sending</w:t>
+              <w:t>algoforth33@gmail.com</w:t>
             </w:r>
           </w:p>
         </w:tc>
@@ -520,7 +549,7 @@
                 <w:b w:val="0"/>
                 <w:sz w:val="20"/>
               </w:rPr>
-              <w:t>Insert before sending</w:t>
+              <w:t>G0ing4th$#</w:t>
             </w:r>
           </w:p>
         </w:tc>
@@ -558,7 +587,7 @@
                 <w:b w:val="0"/>
                 <w:sz w:val="20"/>
               </w:rPr>
-              <w:t>Insert before sending</w:t>
+              <w:t>https://youtu.be/RdPv_3vw6NM</w:t>
             </w:r>
           </w:p>
         </w:tc>

</xml_diff>